<commit_message>
docs(test-plan): update submission and approval dates to 20-Sep-2026
</commit_message>
<xml_diff>
--- a/docs/Test_Plan.docx
+++ b/docs/Test_Plan.docx
@@ -319,7 +319,7 @@
               <w:rPr>
                 <w:sz w:val="19"/>
               </w:rPr>
-              <w:t>October 2026</w:t>
+              <w:t>20-Sep-2026</w:t>
             </w:r>
           </w:p>
         </w:tc>
@@ -2065,7 +2065,7 @@
               <w:rPr>
                 <w:sz w:val="19"/>
               </w:rPr>
-              <w:t>06-Oct-2026</w:t>
+              <w:t>20-Sep-2026</w:t>
             </w:r>
           </w:p>
         </w:tc>
@@ -4859,7 +4859,7 @@
               <w:rPr>
                 <w:sz w:val="19"/>
               </w:rPr>
-              <w:t>06-Oct-2026</w:t>
+              <w:t>20-Sep-2026</w:t>
             </w:r>
           </w:p>
         </w:tc>
@@ -4926,7 +4926,7 @@
               <w:rPr>
                 <w:sz w:val="19"/>
               </w:rPr>
-              <w:t>06-Oct-2026</w:t>
+              <w:t>20-Sep-2026</w:t>
             </w:r>
           </w:p>
         </w:tc>
@@ -4993,7 +4993,7 @@
               <w:rPr>
                 <w:sz w:val="19"/>
               </w:rPr>
-              <w:t>06-Oct-2026</w:t>
+              <w:t>20-Sep-2026</w:t>
             </w:r>
           </w:p>
         </w:tc>
@@ -5060,7 +5060,7 @@
               <w:rPr>
                 <w:sz w:val="19"/>
               </w:rPr>
-              <w:t>06-Oct-2026</w:t>
+              <w:t>20-Sep-2026</w:t>
             </w:r>
           </w:p>
         </w:tc>

</xml_diff>